<commit_message>
Refactor contracts, fix numbering, and update DOCX templates for warehouse services
</commit_message>
<xml_diff>
--- a/public/templates/transport_contract.docx
+++ b/public/templates/transport_contract.docx
@@ -5025,23 +5025,15 @@
               <w:rPr>
                 <w:lang w:val="en-US"/>
               </w:rPr>
-              <w:t>expeditor_director_</w:t>
-            </w:r>
-            <w:proofErr w:type="gramStart"/>
-            <w:r>
-              <w:rPr>
-                <w:lang w:val="en-US"/>
-              </w:rPr>
-              <w:t>name</w:t>
+              <w:t>expeditor_director_name</w:t>
             </w:r>
             <w:proofErr w:type="spellEnd"/>
             <w:r>
               <w:rPr>
                 <w:lang w:val="en-US"/>
               </w:rPr>
-              <w:t xml:space="preserve"> }</w:t>
-            </w:r>
-            <w:proofErr w:type="gramEnd"/>
+              <w:t>}</w:t>
+            </w:r>
           </w:p>
           <w:p>
             <w:pPr>

</xml_diff>